<commit_message>
Update the report and README with the final learning curve
</commit_message>
<xml_diff>
--- a/report/report.docx
+++ b/report/report.docx
@@ -2806,7 +2806,7 @@
         <w:t xml:space="preserve"> </w:t>
       </w:r>
       <w:r>
-        <w:t xml:space="preserve">In-domain, FinBERT does not beat BERT: BERT is ahead by 1.2 points on average, significantly so for one of the three seeds. FinBERT’s advantage appears elsewhere. On PhraseBank it scores 86.0 ± 0.6 against 82.5 ± 2.3 for BERT, whose score ranges from 80.0 to 85.6 across seeds, and with 10% of the training data it leads by about 5 points (Figure 1). The two vocabularies cut tweets into a similar number of pieces (19.4 vs. 19.9 sub-words per tweet), so the gain comes from what FinBERT read during pre-training rather than from shorter inputs.</w:t>
+        <w:t xml:space="preserve">In-domain, FinBERT does not beat BERT: BERT is ahead by 1.2 points on average, significantly so for one of the three seeds. FinBERT’s advantage appears elsewhere. On PhraseBank it scores 86.0 ± 0.6 against 82.5 ± 2.3 for BERT, whose score ranges from 80.0 to 85.6 across seeds, and with 10% of the training data it leads by about 4 points (76.3 vs. 72.5; Figure 1). The two vocabularies cut tweets into a similar number of pieces (19.4 vs. 19.9 sub-words per tweet), so the gain comes from what FinBERT read during pre-training rather than from shorter inputs.</w:t>
       </w:r>
     </w:p>
     <w:p>
@@ -2842,7 +2842,7 @@
         <w:t xml:space="preserve"> </w:t>
       </w:r>
       <w:r>
-        <w:t xml:space="preserve">With 811 labelled tweets (10% of the training set), FinBERT reaches 75.0 macro-F1 and BERT 70.2, while TF-IDF and the CNN reach only 62.6 and 60.9 (Figure 1). The Transformer advantage shrinks as data grows, from about 12 points at 10% to 5 at full size, where FinBERT’s lead over BERT disappears.</w:t>
+        <w:t xml:space="preserve">With 811 labelled tweets (10% of the training set), FinBERT reaches 76.3 macro-F1, within about one point of what TF-IDF and the CNN achieve with all 8,111, while on the same subsets those two reach only 62.6 and 60.9 (Figure 1). The gap between FinBERT and TF-IDF shrinks from 14 points at 10% to 5 at full size, and FinBERT’s lead over BERT (3.8 points at 10%) vanishes at 50% and reverses with the full training set.</w:t>
       </w:r>
     </w:p>
     <w:p>

</xml_diff>